<commit_message>
Documentos parcial analisis y uml y sprites del Momento I y II
</commit_message>
<xml_diff>
--- a/Momento I/Momento I.docx
+++ b/Momento I/Momento I.docx
@@ -6,11 +6,17 @@
       <w:pPr>
         <w:jc w:val="center"/>
         <w:rPr>
+          <w:rFonts w:ascii="Arial" w:hAnsi="Arial" w:cs="Arial"/>
+          <w:sz w:val="24"/>
+          <w:szCs w:val="24"/>
           <w:lang w:val="es-MX"/>
         </w:rPr>
       </w:pPr>
       <w:r>
         <w:rPr>
+          <w:rFonts w:ascii="Arial" w:hAnsi="Arial" w:cs="Arial"/>
+          <w:sz w:val="24"/>
+          <w:szCs w:val="24"/>
           <w:lang w:val="es-MX"/>
         </w:rPr>
         <w:t>Proyecto final</w:t>
@@ -20,19 +26,34 @@
       <w:pPr>
         <w:jc w:val="center"/>
         <w:rPr>
+          <w:rFonts w:ascii="Arial" w:hAnsi="Arial" w:cs="Arial"/>
+          <w:b/>
+          <w:bCs/>
+          <w:sz w:val="24"/>
+          <w:szCs w:val="24"/>
           <w:lang w:val="es-MX"/>
         </w:rPr>
       </w:pPr>
       <w:proofErr w:type="spellStart"/>
       <w:r>
         <w:rPr>
+          <w:rFonts w:ascii="Arial" w:hAnsi="Arial" w:cs="Arial"/>
+          <w:b/>
+          <w:bCs/>
+          <w:sz w:val="24"/>
+          <w:szCs w:val="24"/>
           <w:lang w:val="es-MX"/>
         </w:rPr>
-        <w:t>Amoung</w:t>
+        <w:t>Among</w:t>
       </w:r>
       <w:proofErr w:type="spellEnd"/>
       <w:r>
         <w:rPr>
+          <w:rFonts w:ascii="Arial" w:hAnsi="Arial" w:cs="Arial"/>
+          <w:b/>
+          <w:bCs/>
+          <w:sz w:val="24"/>
+          <w:szCs w:val="24"/>
           <w:lang w:val="es-MX"/>
         </w:rPr>
         <w:t xml:space="preserve"> </w:t>
@@ -40,6 +61,11 @@
       <w:proofErr w:type="spellStart"/>
       <w:r>
         <w:rPr>
+          <w:rFonts w:ascii="Arial" w:hAnsi="Arial" w:cs="Arial"/>
+          <w:b/>
+          <w:bCs/>
+          <w:sz w:val="24"/>
+          <w:szCs w:val="24"/>
           <w:lang w:val="es-MX"/>
         </w:rPr>
         <w:t>Us</w:t>
@@ -47,6 +73,11 @@
       <w:proofErr w:type="spellEnd"/>
       <w:r>
         <w:rPr>
+          <w:rFonts w:ascii="Arial" w:hAnsi="Arial" w:cs="Arial"/>
+          <w:b/>
+          <w:bCs/>
+          <w:sz w:val="24"/>
+          <w:szCs w:val="24"/>
           <w:lang w:val="es-MX"/>
         </w:rPr>
         <w:t xml:space="preserve">, </w:t>
@@ -54,12 +85,22 @@
       <w:proofErr w:type="spellStart"/>
       <w:r>
         <w:rPr>
+          <w:rFonts w:ascii="Arial" w:hAnsi="Arial" w:cs="Arial"/>
+          <w:b/>
+          <w:bCs/>
+          <w:sz w:val="24"/>
+          <w:szCs w:val="24"/>
           <w:lang w:val="es-MX"/>
         </w:rPr>
         <w:t>C</w:t>
       </w:r>
       <w:r>
         <w:rPr>
+          <w:rFonts w:ascii="Arial" w:hAnsi="Arial" w:cs="Arial"/>
+          <w:b/>
+          <w:bCs/>
+          <w:sz w:val="24"/>
+          <w:szCs w:val="24"/>
           <w:lang w:val="es-MX"/>
         </w:rPr>
         <w:t>ovid</w:t>
@@ -67,6 +108,11 @@
       <w:proofErr w:type="spellEnd"/>
       <w:r>
         <w:rPr>
+          <w:rFonts w:ascii="Arial" w:hAnsi="Arial" w:cs="Arial"/>
+          <w:b/>
+          <w:bCs/>
+          <w:sz w:val="24"/>
+          <w:szCs w:val="24"/>
           <w:lang w:val="es-MX"/>
         </w:rPr>
         <w:t xml:space="preserve"> 19</w:t>
@@ -76,6 +122,9 @@
       <w:pPr>
         <w:jc w:val="center"/>
         <w:rPr>
+          <w:rFonts w:ascii="Arial" w:hAnsi="Arial" w:cs="Arial"/>
+          <w:sz w:val="24"/>
+          <w:szCs w:val="24"/>
           <w:lang w:val="es-MX"/>
         </w:rPr>
       </w:pPr>
@@ -83,114 +132,1010 @@
     <w:p>
       <w:pPr>
         <w:jc w:val="both"/>
-      </w:pPr>
-      <w:r>
-        <w:rPr>
+        <w:rPr>
+          <w:rFonts w:ascii="Arial" w:hAnsi="Arial" w:cs="Arial"/>
+          <w:sz w:val="24"/>
+          <w:szCs w:val="24"/>
+        </w:rPr>
+      </w:pPr>
+      <w:r>
+        <w:rPr>
+          <w:rFonts w:ascii="Arial" w:hAnsi="Arial" w:cs="Arial"/>
+          <w:sz w:val="24"/>
+          <w:szCs w:val="24"/>
           <w:lang w:val="es-MX"/>
         </w:rPr>
         <w:t xml:space="preserve">El COVID 19 fue una enfermedad respiratoria causa por un virus llamado </w:t>
       </w:r>
       <w:r>
-        <w:t>SARS-CoV-2</w:t>
-      </w:r>
-      <w:r>
-        <w:t xml:space="preserve">, que tuvo su epicentro en una ciudad de China en el 2009, luego para febrero y marzo fue declarado por la OMS como pandemia, luego de eso muchos países empezaron a tomar precauciones, como el cierre de sus fronteras, </w:t>
-      </w:r>
-      <w:r>
+        <w:rPr>
+          <w:rFonts w:ascii="Arial" w:hAnsi="Arial" w:cs="Arial"/>
+          <w:sz w:val="24"/>
+          <w:szCs w:val="24"/>
+        </w:rPr>
+        <w:t>SARS-CoV-2, que tuvo su epicentro en una ciudad de China en el 20</w:t>
+      </w:r>
+      <w:r>
+        <w:rPr>
+          <w:rFonts w:ascii="Arial" w:hAnsi="Arial" w:cs="Arial"/>
+          <w:sz w:val="24"/>
+          <w:szCs w:val="24"/>
+        </w:rPr>
+        <w:t>1</w:t>
+      </w:r>
+      <w:r>
+        <w:rPr>
+          <w:rFonts w:ascii="Arial" w:hAnsi="Arial" w:cs="Arial"/>
+          <w:sz w:val="24"/>
+          <w:szCs w:val="24"/>
+        </w:rPr>
+        <w:t>9, luego para febrero y marzo</w:t>
+      </w:r>
+      <w:r>
+        <w:rPr>
+          <w:rFonts w:ascii="Arial" w:hAnsi="Arial" w:cs="Arial"/>
+          <w:sz w:val="24"/>
+          <w:szCs w:val="24"/>
+        </w:rPr>
+        <w:t xml:space="preserve"> de 2020</w:t>
+      </w:r>
+      <w:r>
+        <w:rPr>
+          <w:rFonts w:ascii="Arial" w:hAnsi="Arial" w:cs="Arial"/>
+          <w:sz w:val="24"/>
+          <w:szCs w:val="24"/>
+        </w:rPr>
+        <w:t xml:space="preserve"> fue declarado por la OMS como pandemia, luego de eso muchos países empezaron a tomar precauciones, como el cierre de sus fronteras, </w:t>
+      </w:r>
+      <w:r>
+        <w:rPr>
+          <w:rFonts w:ascii="Arial" w:hAnsi="Arial" w:cs="Arial"/>
+          <w:sz w:val="24"/>
+          <w:szCs w:val="24"/>
+        </w:rPr>
         <w:t xml:space="preserve">entre esos Colombia que por orden del presidente el </w:t>
       </w:r>
       <w:proofErr w:type="gramStart"/>
       <w:r>
+        <w:rPr>
+          <w:rFonts w:ascii="Arial" w:hAnsi="Arial" w:cs="Arial"/>
+          <w:sz w:val="24"/>
+          <w:szCs w:val="24"/>
+        </w:rPr>
         <w:t>24  de</w:t>
       </w:r>
       <w:proofErr w:type="gramEnd"/>
       <w:r>
+        <w:rPr>
+          <w:rFonts w:ascii="Arial" w:hAnsi="Arial" w:cs="Arial"/>
+          <w:sz w:val="24"/>
+          <w:szCs w:val="24"/>
+        </w:rPr>
         <w:t xml:space="preserve"> marzo ordeno el confinamiento, exceptuando algunos casos especiales. Para el desafío final de informática 2 elegí este hecho que marco la historia de nuestro País, y el tipo de juego que voy a representar ese evento es el famoso juego </w:t>
       </w:r>
       <w:proofErr w:type="spellStart"/>
       <w:r>
-        <w:t>Amoung</w:t>
+        <w:rPr>
+          <w:rFonts w:ascii="Arial" w:hAnsi="Arial" w:cs="Arial"/>
+          <w:sz w:val="24"/>
+          <w:szCs w:val="24"/>
+        </w:rPr>
+        <w:t>Among</w:t>
       </w:r>
       <w:proofErr w:type="spellEnd"/>
       <w:r>
+        <w:rPr>
+          <w:rFonts w:ascii="Arial" w:hAnsi="Arial" w:cs="Arial"/>
+          <w:sz w:val="24"/>
+          <w:szCs w:val="24"/>
+        </w:rPr>
         <w:t xml:space="preserve"> </w:t>
       </w:r>
       <w:proofErr w:type="spellStart"/>
       <w:r>
+        <w:rPr>
+          <w:rFonts w:ascii="Arial" w:hAnsi="Arial" w:cs="Arial"/>
+          <w:sz w:val="24"/>
+          <w:szCs w:val="24"/>
+        </w:rPr>
         <w:t>Us</w:t>
       </w:r>
       <w:proofErr w:type="spellEnd"/>
       <w:r>
+        <w:rPr>
+          <w:rFonts w:ascii="Arial" w:hAnsi="Arial" w:cs="Arial"/>
+          <w:sz w:val="24"/>
+          <w:szCs w:val="24"/>
+        </w:rPr>
         <w:t xml:space="preserve">, es un juego multijugador en línea </w:t>
       </w:r>
       <w:proofErr w:type="gramStart"/>
       <w:r>
+        <w:rPr>
+          <w:rFonts w:ascii="Arial" w:hAnsi="Arial" w:cs="Arial"/>
+          <w:sz w:val="24"/>
+          <w:szCs w:val="24"/>
+        </w:rPr>
         <w:t>de  estrategia</w:t>
       </w:r>
       <w:proofErr w:type="gramEnd"/>
       <w:r>
+        <w:rPr>
+          <w:rFonts w:ascii="Arial" w:hAnsi="Arial" w:cs="Arial"/>
+          <w:sz w:val="24"/>
+          <w:szCs w:val="24"/>
+        </w:rPr>
         <w:t xml:space="preserve"> que cosiste en encontrar el impostor</w:t>
       </w:r>
       <w:r>
+        <w:rPr>
+          <w:rFonts w:ascii="Arial" w:hAnsi="Arial" w:cs="Arial"/>
+          <w:sz w:val="24"/>
+          <w:szCs w:val="24"/>
+        </w:rPr>
         <w:t>. El juego va tener dos niveles los cuales va tratar los principales problemas del evento histórico:</w:t>
       </w:r>
     </w:p>
     <w:p>
       <w:pPr>
         <w:jc w:val="both"/>
-      </w:pPr>
-      <w:r>
-        <w:t xml:space="preserve">Nivel 1: Encontrar el virus COVID 19, hay muchos virus y entre ellos </w:t>
+        <w:rPr>
+          <w:rFonts w:ascii="Arial" w:hAnsi="Arial" w:cs="Arial"/>
+          <w:sz w:val="24"/>
+          <w:szCs w:val="24"/>
+        </w:rPr>
+      </w:pPr>
+      <w:r>
+        <w:rPr>
+          <w:rFonts w:ascii="Arial" w:hAnsi="Arial" w:cs="Arial"/>
+          <w:b/>
+          <w:bCs/>
+          <w:sz w:val="24"/>
+          <w:szCs w:val="24"/>
+        </w:rPr>
+        <w:t>Nivel 1:</w:t>
+      </w:r>
+      <w:r>
+        <w:rPr>
+          <w:rFonts w:ascii="Arial" w:hAnsi="Arial" w:cs="Arial"/>
+          <w:sz w:val="24"/>
+          <w:szCs w:val="24"/>
+        </w:rPr>
+        <w:t xml:space="preserve"> Encontrar el virus COVID 19, hay muchos virus y entre ellos </w:t>
       </w:r>
       <w:proofErr w:type="gramStart"/>
       <w:r>
+        <w:rPr>
+          <w:rFonts w:ascii="Arial" w:hAnsi="Arial" w:cs="Arial"/>
+          <w:sz w:val="24"/>
+          <w:szCs w:val="24"/>
+        </w:rPr>
         <w:t>esta colado</w:t>
       </w:r>
       <w:proofErr w:type="gramEnd"/>
       <w:r>
+        <w:rPr>
+          <w:rFonts w:ascii="Arial" w:hAnsi="Arial" w:cs="Arial"/>
+          <w:sz w:val="24"/>
+          <w:szCs w:val="24"/>
+        </w:rPr>
         <w:t xml:space="preserve"> el virus que causa la infección respiratoria, este virus se </w:t>
       </w:r>
       <w:r>
+        <w:rPr>
+          <w:rFonts w:ascii="Arial" w:hAnsi="Arial" w:cs="Arial"/>
+          <w:sz w:val="24"/>
+          <w:szCs w:val="24"/>
+        </w:rPr>
         <w:t>disfraza</w:t>
       </w:r>
       <w:r>
+        <w:rPr>
+          <w:rFonts w:ascii="Arial" w:hAnsi="Arial" w:cs="Arial"/>
+          <w:sz w:val="24"/>
+          <w:szCs w:val="24"/>
+        </w:rPr>
         <w:t xml:space="preserve"> de otros virus comunes que causan gripe o cualquie</w:t>
       </w:r>
       <w:r>
-        <w:t xml:space="preserve">r afección respiratoria. En este nivel solo encontrarlo y encerrarlo solo eso. </w:t>
+        <w:rPr>
+          <w:rFonts w:ascii="Arial" w:hAnsi="Arial" w:cs="Arial"/>
+          <w:sz w:val="24"/>
+          <w:szCs w:val="24"/>
+        </w:rPr>
+        <w:t xml:space="preserve">r afección respiratoria. En este nivel solo </w:t>
+      </w:r>
+      <w:r>
+        <w:rPr>
+          <w:rFonts w:ascii="Arial" w:hAnsi="Arial" w:cs="Arial"/>
+          <w:sz w:val="24"/>
+          <w:szCs w:val="24"/>
+        </w:rPr>
+        <w:t xml:space="preserve">es </w:t>
+      </w:r>
+      <w:r>
+        <w:rPr>
+          <w:rFonts w:ascii="Arial" w:hAnsi="Arial" w:cs="Arial"/>
+          <w:sz w:val="24"/>
+          <w:szCs w:val="24"/>
+        </w:rPr>
+        <w:t>encontrarlo y encerrarlo</w:t>
+      </w:r>
+      <w:r>
+        <w:rPr>
+          <w:rFonts w:ascii="Arial" w:hAnsi="Arial" w:cs="Arial"/>
+          <w:sz w:val="24"/>
+          <w:szCs w:val="24"/>
+        </w:rPr>
+        <w:t xml:space="preserve"> o confinarlo en un espacio como una cárcel, este primer </w:t>
+      </w:r>
+      <w:r>
+        <w:rPr>
+          <w:rFonts w:ascii="Arial" w:hAnsi="Arial" w:cs="Arial"/>
+          <w:sz w:val="24"/>
+          <w:szCs w:val="24"/>
+        </w:rPr>
+        <w:t xml:space="preserve">nivel </w:t>
+      </w:r>
+      <w:r>
+        <w:rPr>
+          <w:rFonts w:ascii="Arial" w:hAnsi="Arial" w:cs="Arial"/>
+          <w:sz w:val="24"/>
+          <w:szCs w:val="24"/>
+        </w:rPr>
+        <w:t xml:space="preserve">se pueden generar 5 virus </w:t>
+      </w:r>
+      <w:proofErr w:type="spellStart"/>
+      <w:r>
+        <w:rPr>
+          <w:rFonts w:ascii="Arial" w:hAnsi="Arial" w:cs="Arial"/>
+          <w:sz w:val="24"/>
+          <w:szCs w:val="24"/>
+        </w:rPr>
+        <w:t>covid</w:t>
+      </w:r>
+      <w:proofErr w:type="spellEnd"/>
+      <w:r>
+        <w:rPr>
+          <w:rFonts w:ascii="Arial" w:hAnsi="Arial" w:cs="Arial"/>
+          <w:sz w:val="24"/>
+          <w:szCs w:val="24"/>
+        </w:rPr>
+        <w:t>, cuando lo encuentre todos se gana el nivel pasa al siguiente</w:t>
+      </w:r>
+      <w:r>
+        <w:rPr>
+          <w:rFonts w:ascii="Arial" w:hAnsi="Arial" w:cs="Arial"/>
+          <w:sz w:val="24"/>
+          <w:szCs w:val="24"/>
+        </w:rPr>
+        <w:t xml:space="preserve">. </w:t>
+      </w:r>
+      <w:r>
+        <w:rPr>
+          <w:rFonts w:ascii="Arial" w:hAnsi="Arial" w:cs="Arial"/>
+          <w:sz w:val="24"/>
+          <w:szCs w:val="24"/>
+        </w:rPr>
+        <w:t>El espacio en que se desarrollara es un laboratorio</w:t>
+      </w:r>
+      <w:r>
+        <w:rPr>
+          <w:rFonts w:ascii="Arial" w:hAnsi="Arial" w:cs="Arial"/>
+          <w:sz w:val="24"/>
+          <w:szCs w:val="24"/>
+        </w:rPr>
+        <w:t xml:space="preserve">, el personaje que los va encontrar puede ser una plaqueta blanca, en su defecto un </w:t>
+      </w:r>
+      <w:proofErr w:type="spellStart"/>
+      <w:r>
+        <w:rPr>
+          <w:rFonts w:ascii="Arial" w:hAnsi="Arial" w:cs="Arial"/>
+          <w:sz w:val="24"/>
+          <w:szCs w:val="24"/>
+        </w:rPr>
+        <w:t>among</w:t>
+      </w:r>
+      <w:proofErr w:type="spellEnd"/>
+      <w:r>
+        <w:rPr>
+          <w:rFonts w:ascii="Arial" w:hAnsi="Arial" w:cs="Arial"/>
+          <w:sz w:val="24"/>
+          <w:szCs w:val="24"/>
+        </w:rPr>
+        <w:t xml:space="preserve"> blanco, los virus contagiosos o peligrosos </w:t>
+      </w:r>
+      <w:proofErr w:type="spellStart"/>
+      <w:r>
+        <w:rPr>
+          <w:rFonts w:ascii="Arial" w:hAnsi="Arial" w:cs="Arial"/>
+          <w:sz w:val="24"/>
+          <w:szCs w:val="24"/>
+        </w:rPr>
+        <w:t>among</w:t>
+      </w:r>
+      <w:proofErr w:type="spellEnd"/>
+      <w:r>
+        <w:rPr>
+          <w:rFonts w:ascii="Arial" w:hAnsi="Arial" w:cs="Arial"/>
+          <w:sz w:val="24"/>
+          <w:szCs w:val="24"/>
+        </w:rPr>
+        <w:t xml:space="preserve"> de color rojo. Va tener un reloj con un tiempo limite de 2 minutos con conteo regresivo</w:t>
+      </w:r>
+      <w:r>
+        <w:rPr>
+          <w:rFonts w:ascii="Arial" w:hAnsi="Arial" w:cs="Arial"/>
+          <w:sz w:val="24"/>
+          <w:szCs w:val="24"/>
+        </w:rPr>
+        <w:t xml:space="preserve">, el cual si se acaba el tiempo también pierde el </w:t>
+      </w:r>
+      <w:proofErr w:type="gramStart"/>
+      <w:r>
+        <w:rPr>
+          <w:rFonts w:ascii="Arial" w:hAnsi="Arial" w:cs="Arial"/>
+          <w:sz w:val="24"/>
+          <w:szCs w:val="24"/>
+        </w:rPr>
+        <w:t xml:space="preserve">nivel; </w:t>
+      </w:r>
+      <w:r>
+        <w:rPr>
+          <w:rFonts w:ascii="Arial" w:hAnsi="Arial" w:cs="Arial"/>
+          <w:sz w:val="24"/>
+          <w:szCs w:val="24"/>
+        </w:rPr>
+        <w:t xml:space="preserve"> además</w:t>
+      </w:r>
+      <w:proofErr w:type="gramEnd"/>
+      <w:r>
+        <w:rPr>
+          <w:rFonts w:ascii="Arial" w:hAnsi="Arial" w:cs="Arial"/>
+          <w:sz w:val="24"/>
+          <w:szCs w:val="24"/>
+        </w:rPr>
+        <w:t xml:space="preserve"> unos iconos de vida, se pueden representar </w:t>
+      </w:r>
+      <w:r>
+        <w:rPr>
+          <w:rFonts w:ascii="Arial" w:hAnsi="Arial" w:cs="Arial"/>
+          <w:sz w:val="24"/>
+          <w:szCs w:val="24"/>
+        </w:rPr>
+        <w:t xml:space="preserve">con iconos tipo corazón. </w:t>
+      </w:r>
+      <w:r>
+        <w:rPr>
+          <w:rFonts w:ascii="Arial" w:hAnsi="Arial" w:cs="Arial"/>
+          <w:sz w:val="24"/>
+          <w:szCs w:val="24"/>
+        </w:rPr>
+        <w:t>En el escenario hay capsulas o vitaminas para que hacen mas fuerte el personaje principal,</w:t>
+      </w:r>
+      <w:r>
+        <w:rPr>
+          <w:rFonts w:ascii="Arial" w:hAnsi="Arial" w:cs="Arial"/>
+          <w:sz w:val="24"/>
+          <w:szCs w:val="24"/>
+        </w:rPr>
+        <w:t xml:space="preserve"> después de eso que pasa el efecto se vuelve torpe por 20 segundos por cual se </w:t>
+      </w:r>
+      <w:proofErr w:type="spellStart"/>
+      <w:r>
+        <w:rPr>
+          <w:rFonts w:ascii="Arial" w:hAnsi="Arial" w:cs="Arial"/>
+          <w:sz w:val="24"/>
+          <w:szCs w:val="24"/>
+        </w:rPr>
+        <w:t>de</w:t>
+      </w:r>
+      <w:proofErr w:type="spellEnd"/>
+      <w:r>
+        <w:rPr>
+          <w:rFonts w:ascii="Arial" w:hAnsi="Arial" w:cs="Arial"/>
+          <w:sz w:val="24"/>
+          <w:szCs w:val="24"/>
+        </w:rPr>
+        <w:t xml:space="preserve"> debe resguardar, </w:t>
+      </w:r>
+      <w:r>
+        <w:rPr>
+          <w:rFonts w:ascii="Arial" w:hAnsi="Arial" w:cs="Arial"/>
+          <w:sz w:val="24"/>
+          <w:szCs w:val="24"/>
+        </w:rPr>
+        <w:t xml:space="preserve">así como también habrá potenciadores para los enemigos se vuelven mucho más fuertes y agresivos por un tiempo </w:t>
+      </w:r>
+      <w:r>
+        <w:rPr>
+          <w:rFonts w:ascii="Arial" w:hAnsi="Arial" w:cs="Arial"/>
+          <w:sz w:val="24"/>
+          <w:szCs w:val="24"/>
+        </w:rPr>
+        <w:t>limite de 15 segundos. La vista que he propuesto es tipo cenital</w:t>
+      </w:r>
+      <w:r>
+        <w:rPr>
+          <w:rFonts w:ascii="Arial" w:hAnsi="Arial" w:cs="Arial"/>
+          <w:sz w:val="24"/>
+          <w:szCs w:val="24"/>
+        </w:rPr>
+        <w:t>.</w:t>
       </w:r>
     </w:p>
     <w:p>
       <w:pPr>
         <w:jc w:val="both"/>
+        <w:rPr>
+          <w:rFonts w:ascii="Arial" w:hAnsi="Arial" w:cs="Arial"/>
+          <w:sz w:val="24"/>
+          <w:szCs w:val="24"/>
+        </w:rPr>
       </w:pPr>
     </w:p>
     <w:p>
       <w:pPr>
         <w:jc w:val="both"/>
         <w:rPr>
+          <w:rFonts w:ascii="Arial" w:hAnsi="Arial" w:cs="Arial"/>
+          <w:sz w:val="24"/>
+          <w:szCs w:val="24"/>
+        </w:rPr>
+      </w:pPr>
+    </w:p>
+    <w:p>
+      <w:pPr>
+        <w:jc w:val="both"/>
+        <w:rPr>
+          <w:rFonts w:ascii="Arial" w:hAnsi="Arial" w:cs="Arial"/>
+          <w:sz w:val="24"/>
+          <w:szCs w:val="24"/>
+        </w:rPr>
+      </w:pPr>
+    </w:p>
+    <w:p>
+      <w:pPr>
+        <w:jc w:val="both"/>
+        <w:rPr>
+          <w:rFonts w:ascii="Arial" w:hAnsi="Arial" w:cs="Arial"/>
+          <w:sz w:val="24"/>
+          <w:szCs w:val="24"/>
+        </w:rPr>
+      </w:pPr>
+    </w:p>
+    <w:p>
+      <w:pPr>
+        <w:jc w:val="both"/>
+        <w:rPr>
+          <w:rFonts w:ascii="Arial" w:hAnsi="Arial" w:cs="Arial"/>
+          <w:sz w:val="24"/>
+          <w:szCs w:val="24"/>
+        </w:rPr>
+      </w:pPr>
+    </w:p>
+    <w:p>
+      <w:pPr>
+        <w:jc w:val="both"/>
+        <w:rPr>
+          <w:rFonts w:ascii="Arial" w:hAnsi="Arial" w:cs="Arial"/>
+          <w:sz w:val="24"/>
+          <w:szCs w:val="24"/>
+        </w:rPr>
+      </w:pPr>
+    </w:p>
+    <w:p>
+      <w:pPr>
+        <w:jc w:val="both"/>
+        <w:rPr>
+          <w:rFonts w:ascii="Arial" w:hAnsi="Arial" w:cs="Arial"/>
+          <w:sz w:val="24"/>
+          <w:szCs w:val="24"/>
+        </w:rPr>
+      </w:pPr>
+    </w:p>
+    <w:p>
+      <w:pPr>
+        <w:jc w:val="both"/>
+        <w:rPr>
+          <w:rFonts w:ascii="Arial" w:hAnsi="Arial" w:cs="Arial"/>
+          <w:sz w:val="24"/>
+          <w:szCs w:val="24"/>
+        </w:rPr>
+      </w:pPr>
+      <w:r>
+        <w:rPr>
+          <w:rFonts w:ascii="Arial" w:hAnsi="Arial" w:cs="Arial"/>
+          <w:b/>
+          <w:bCs/>
+          <w:sz w:val="24"/>
+          <w:szCs w:val="24"/>
+        </w:rPr>
+        <w:t>Nivel 2:</w:t>
+      </w:r>
+      <w:r>
+        <w:rPr>
+          <w:rFonts w:ascii="Arial" w:hAnsi="Arial" w:cs="Arial"/>
+          <w:sz w:val="24"/>
+          <w:szCs w:val="24"/>
+        </w:rPr>
+        <w:t xml:space="preserve"> Ya en este nivel se encontró la vacuna, entonces mezcla acciones del primer nivel que es encontrarlo y luego eliminarlo, pero si encuentra un virus bueno </w:t>
+      </w:r>
+      <w:r>
+        <w:rPr>
+          <w:rFonts w:ascii="Arial" w:hAnsi="Arial" w:cs="Arial"/>
+          <w:sz w:val="24"/>
+          <w:szCs w:val="24"/>
+        </w:rPr>
+        <w:lastRenderedPageBreak/>
+        <w:t>y lo elimina pierdes</w:t>
+      </w:r>
+      <w:r>
+        <w:rPr>
+          <w:rFonts w:ascii="Arial" w:hAnsi="Arial" w:cs="Arial"/>
+          <w:sz w:val="24"/>
+          <w:szCs w:val="24"/>
+        </w:rPr>
+        <w:t>.</w:t>
+      </w:r>
+      <w:r>
+        <w:rPr>
+          <w:rFonts w:ascii="Arial" w:hAnsi="Arial" w:cs="Arial"/>
+          <w:sz w:val="24"/>
+          <w:szCs w:val="24"/>
+        </w:rPr>
+        <w:t xml:space="preserve"> El personaje principal </w:t>
+      </w:r>
+      <w:proofErr w:type="spellStart"/>
+      <w:r>
+        <w:rPr>
+          <w:rFonts w:ascii="Arial" w:hAnsi="Arial" w:cs="Arial"/>
+          <w:sz w:val="24"/>
+          <w:szCs w:val="24"/>
+        </w:rPr>
+        <w:t>esta</w:t>
+      </w:r>
+      <w:proofErr w:type="spellEnd"/>
+      <w:r>
+        <w:rPr>
+          <w:rFonts w:ascii="Arial" w:hAnsi="Arial" w:cs="Arial"/>
+          <w:sz w:val="24"/>
+          <w:szCs w:val="24"/>
+        </w:rPr>
+        <w:t xml:space="preserve"> patrullando el laboratorio buscando los virus que se escaparon</w:t>
+      </w:r>
+      <w:r>
+        <w:rPr>
+          <w:rFonts w:ascii="Arial" w:hAnsi="Arial" w:cs="Arial"/>
+          <w:sz w:val="24"/>
+          <w:szCs w:val="24"/>
+        </w:rPr>
+        <w:t xml:space="preserve">, debe aprovechar cuando encuentre un estimulante que le da poder para identificar los </w:t>
+      </w:r>
+      <w:proofErr w:type="gramStart"/>
+      <w:r>
+        <w:rPr>
+          <w:rFonts w:ascii="Arial" w:hAnsi="Arial" w:cs="Arial"/>
+          <w:sz w:val="24"/>
+          <w:szCs w:val="24"/>
+        </w:rPr>
+        <w:t>impostores  e</w:t>
+      </w:r>
+      <w:proofErr w:type="gramEnd"/>
+      <w:r>
+        <w:rPr>
+          <w:rFonts w:ascii="Arial" w:hAnsi="Arial" w:cs="Arial"/>
+          <w:sz w:val="24"/>
+          <w:szCs w:val="24"/>
+        </w:rPr>
+        <w:t xml:space="preserve"> ir tras ellos antes que ellos encuentren también un estimulante y se vuelvan invulnerables por un periodo de tiempo corto.</w:t>
+      </w:r>
+      <w:r>
+        <w:rPr>
+          <w:rFonts w:ascii="Arial" w:hAnsi="Arial" w:cs="Arial"/>
+          <w:sz w:val="24"/>
+          <w:szCs w:val="24"/>
+        </w:rPr>
+        <w:t xml:space="preserve"> L</w:t>
+      </w:r>
+      <w:r>
+        <w:rPr>
+          <w:rFonts w:ascii="Arial" w:hAnsi="Arial" w:cs="Arial"/>
+          <w:sz w:val="24"/>
+          <w:szCs w:val="24"/>
+        </w:rPr>
+        <w:t xml:space="preserve">as físicas que voy emplear </w:t>
+      </w:r>
+      <w:r>
+        <w:rPr>
+          <w:rFonts w:ascii="Arial" w:hAnsi="Arial" w:cs="Arial"/>
+          <w:sz w:val="24"/>
+          <w:szCs w:val="24"/>
+        </w:rPr>
+        <w:t>salto parabólico para esquivar obstáculos, otra física lanzar objetos que involucre velocidad inicial, gravedad y velocidad final</w:t>
+      </w:r>
+      <w:r>
+        <w:rPr>
+          <w:rFonts w:ascii="Arial" w:hAnsi="Arial" w:cs="Arial"/>
+          <w:sz w:val="24"/>
+          <w:szCs w:val="24"/>
+        </w:rPr>
+        <w:t xml:space="preserve">. </w:t>
+      </w:r>
+      <w:r>
+        <w:rPr>
+          <w:rFonts w:ascii="Arial" w:hAnsi="Arial" w:cs="Arial"/>
+          <w:sz w:val="24"/>
+          <w:szCs w:val="24"/>
+        </w:rPr>
+        <w:t>También un movimiento oscilatorio</w:t>
+      </w:r>
+      <w:r>
+        <w:rPr>
+          <w:rFonts w:ascii="Arial" w:hAnsi="Arial" w:cs="Arial"/>
+          <w:sz w:val="24"/>
+          <w:szCs w:val="24"/>
+        </w:rPr>
+        <w:t xml:space="preserve"> y otras que se pueda implementar que veamos en el laboratorio. La vista para este nivel está enfocada en visión de plataforma, </w:t>
+      </w:r>
+    </w:p>
+    <w:p>
+      <w:pPr>
+        <w:jc w:val="both"/>
+        <w:rPr>
+          <w:rFonts w:ascii="Arial" w:hAnsi="Arial" w:cs="Arial"/>
+          <w:sz w:val="24"/>
+          <w:szCs w:val="24"/>
+        </w:rPr>
+      </w:pPr>
+    </w:p>
+    <w:p>
+      <w:pPr>
+        <w:jc w:val="both"/>
+        <w:rPr>
+          <w:rFonts w:ascii="Arial" w:hAnsi="Arial" w:cs="Arial"/>
+          <w:sz w:val="24"/>
+          <w:szCs w:val="24"/>
           <w:lang w:val="es-MX"/>
         </w:rPr>
       </w:pPr>
-      <w:r>
-        <w:t xml:space="preserve">Nivel 2: Ya en este nivel se encontró la vacuna, entonces mezcla acciones del primer nivel que es encontrarlo y luego eliminarlo, pero si encuentra un virus bueno y lo elimina pierdes, </w:t>
-      </w:r>
-      <w:r>
-        <w:t>aun me falta por implementar bien ambos niveles, pero en si es la idea principal del juego.</w:t>
-      </w:r>
     </w:p>
     <w:p>
       <w:pPr>
         <w:jc w:val="center"/>
         <w:rPr>
+          <w:rFonts w:ascii="Arial" w:hAnsi="Arial" w:cs="Arial"/>
+          <w:sz w:val="24"/>
+          <w:szCs w:val="24"/>
           <w:lang w:val="es-MX"/>
         </w:rPr>
       </w:pPr>
     </w:p>
     <w:p>
       <w:pPr>
-        <w:jc w:val="center"/>
-        <w:rPr>
+        <w:pStyle w:val="NormalWeb"/>
+        <w:rPr>
+          <w:rFonts w:ascii="Arial" w:hAnsi="Arial" w:cs="Arial"/>
+        </w:rPr>
+      </w:pPr>
+      <w:r>
+        <w:rPr>
+          <w:rFonts w:ascii="Arial" w:hAnsi="Arial" w:cs="Arial"/>
+          <w:b/>
+          <w:bCs/>
+        </w:rPr>
+        <w:t xml:space="preserve">Agente Inteligente: El Virus Impostor </w:t>
+      </w:r>
+    </w:p>
+    <w:p>
+      <w:pPr>
+        <w:pStyle w:val="NormalWeb"/>
+        <w:numPr>
+          <w:ilvl w:val="0"/>
+          <w:numId w:val="1"/>
+        </w:numPr>
+        <w:rPr>
+          <w:rFonts w:ascii="Arial" w:hAnsi="Arial" w:cs="Arial"/>
+        </w:rPr>
+      </w:pPr>
+      <w:r>
+        <w:rPr>
+          <w:rFonts w:ascii="Arial" w:hAnsi="Arial" w:cs="Arial"/>
+          <w:b/>
+          <w:bCs/>
+        </w:rPr>
+        <w:t>Percepción:</w:t>
+      </w:r>
+      <w:r>
+        <w:rPr>
+          <w:rFonts w:ascii="Arial" w:hAnsi="Arial" w:cs="Arial"/>
+        </w:rPr>
+        <w:t xml:space="preserve"> El </w:t>
+      </w:r>
+      <w:r>
+        <w:rPr>
+          <w:rFonts w:ascii="Arial" w:hAnsi="Arial" w:cs="Arial"/>
+        </w:rPr>
+        <w:t>impostor lee</w:t>
+      </w:r>
+      <w:r>
+        <w:rPr>
+          <w:rFonts w:ascii="Arial" w:hAnsi="Arial" w:cs="Arial"/>
+        </w:rPr>
+        <w:t xml:space="preserve"> constantemente las </w:t>
+      </w:r>
+      <w:proofErr w:type="gramStart"/>
+      <w:r>
+        <w:rPr>
+          <w:rFonts w:ascii="Arial" w:hAnsi="Arial" w:cs="Arial"/>
+        </w:rPr>
+        <w:t>coordenadas  del</w:t>
+      </w:r>
+      <w:proofErr w:type="gramEnd"/>
+      <w:r>
+        <w:rPr>
+          <w:rFonts w:ascii="Arial" w:hAnsi="Arial" w:cs="Arial"/>
+        </w:rPr>
+        <w:t xml:space="preserve"> personaje principal para calcular a qué distancia se encuentra</w:t>
+      </w:r>
+      <w:r>
+        <w:rPr>
+          <w:rFonts w:ascii="Arial" w:hAnsi="Arial" w:cs="Arial"/>
+        </w:rPr>
+        <w:t xml:space="preserve">, los parámetros los defino </w:t>
+      </w:r>
+      <w:proofErr w:type="spellStart"/>
+      <w:r>
+        <w:rPr>
+          <w:rFonts w:ascii="Arial" w:hAnsi="Arial" w:cs="Arial"/>
+        </w:rPr>
+        <w:t>mas</w:t>
+      </w:r>
+      <w:proofErr w:type="spellEnd"/>
+      <w:r>
+        <w:rPr>
+          <w:rFonts w:ascii="Arial" w:hAnsi="Arial" w:cs="Arial"/>
+        </w:rPr>
+        <w:t xml:space="preserve"> adelante</w:t>
+      </w:r>
+      <w:r>
+        <w:rPr>
+          <w:rFonts w:ascii="Arial" w:hAnsi="Arial" w:cs="Arial"/>
+        </w:rPr>
+        <w:t xml:space="preserve">. </w:t>
+      </w:r>
+    </w:p>
+    <w:p>
+      <w:pPr>
+        <w:pStyle w:val="NormalWeb"/>
+        <w:numPr>
+          <w:ilvl w:val="0"/>
+          <w:numId w:val="1"/>
+        </w:numPr>
+        <w:rPr>
+          <w:rFonts w:ascii="Arial" w:hAnsi="Arial" w:cs="Arial"/>
+        </w:rPr>
+      </w:pPr>
+      <w:r>
+        <w:rPr>
+          <w:rFonts w:ascii="Arial" w:hAnsi="Arial" w:cs="Arial"/>
+          <w:b/>
+          <w:bCs/>
+        </w:rPr>
+        <w:t>Razonamiento:</w:t>
+      </w:r>
+      <w:r>
+        <w:rPr>
+          <w:rFonts w:ascii="Arial" w:hAnsi="Arial" w:cs="Arial"/>
+        </w:rPr>
+        <w:t xml:space="preserve"> </w:t>
+      </w:r>
+      <w:r>
+        <w:rPr>
+          <w:rFonts w:ascii="Arial" w:hAnsi="Arial" w:cs="Arial"/>
+        </w:rPr>
+        <w:t xml:space="preserve">Con condicionales como </w:t>
+      </w:r>
+      <w:proofErr w:type="spellStart"/>
+      <w:r>
+        <w:rPr>
+          <w:rFonts w:ascii="Arial" w:hAnsi="Arial" w:cs="Arial"/>
+        </w:rPr>
+        <w:t>el</w:t>
+      </w:r>
+      <w:proofErr w:type="spellEnd"/>
+      <w:proofErr w:type="gramStart"/>
+      <w:r>
+        <w:rPr>
+          <w:rFonts w:ascii="Arial" w:hAnsi="Arial" w:cs="Arial"/>
+        </w:rPr>
+        <w:t xml:space="preserve">  </w:t>
+      </w:r>
+      <w:r>
+        <w:rPr>
+          <w:rFonts w:ascii="Arial" w:hAnsi="Arial" w:cs="Arial"/>
+        </w:rPr>
+        <w:t xml:space="preserve"> (</w:t>
+      </w:r>
+      <w:proofErr w:type="spellStart"/>
+      <w:proofErr w:type="gramEnd"/>
+      <w:r>
+        <w:rPr>
+          <w:rStyle w:val="CdigoHTML"/>
+          <w:rFonts w:ascii="Arial" w:hAnsi="Arial" w:cs="Arial"/>
+          <w:sz w:val="24"/>
+          <w:szCs w:val="24"/>
+        </w:rPr>
+        <w:t>if</w:t>
+      </w:r>
+      <w:proofErr w:type="spellEnd"/>
+      <w:r>
+        <w:rPr>
+          <w:rFonts w:ascii="Arial" w:hAnsi="Arial" w:cs="Arial"/>
+        </w:rPr>
+        <w:t xml:space="preserve">), el virus decide: si el jugador está </w:t>
+      </w:r>
+      <w:r>
+        <w:rPr>
+          <w:rFonts w:ascii="Arial" w:hAnsi="Arial" w:cs="Arial"/>
+        </w:rPr>
+        <w:t xml:space="preserve">a cierta distancia en </w:t>
+      </w:r>
+      <w:r>
+        <w:rPr>
+          <w:rFonts w:ascii="Arial" w:hAnsi="Arial" w:cs="Arial"/>
+        </w:rPr>
+        <w:t xml:space="preserve">píxeles, </w:t>
+      </w:r>
+      <w:r>
+        <w:rPr>
+          <w:rFonts w:ascii="Arial" w:hAnsi="Arial" w:cs="Arial"/>
+        </w:rPr>
+        <w:t xml:space="preserve">si </w:t>
+      </w:r>
+      <w:proofErr w:type="spellStart"/>
+      <w:r>
+        <w:rPr>
+          <w:rFonts w:ascii="Arial" w:hAnsi="Arial" w:cs="Arial"/>
+        </w:rPr>
+        <w:t>esta</w:t>
+      </w:r>
+      <w:proofErr w:type="spellEnd"/>
+      <w:r>
+        <w:rPr>
+          <w:rFonts w:ascii="Arial" w:hAnsi="Arial" w:cs="Arial"/>
+        </w:rPr>
+        <w:t xml:space="preserve"> dentro del rango para lanzar un ataque o mejor </w:t>
+      </w:r>
+      <w:r>
+        <w:rPr>
+          <w:rFonts w:ascii="Arial" w:hAnsi="Arial" w:cs="Arial"/>
+        </w:rPr>
+        <w:t xml:space="preserve"> decide patrullar. </w:t>
+      </w:r>
+    </w:p>
+    <w:p>
+      <w:pPr>
+        <w:pStyle w:val="NormalWeb"/>
+        <w:numPr>
+          <w:ilvl w:val="0"/>
+          <w:numId w:val="1"/>
+        </w:numPr>
+        <w:rPr>
+          <w:rFonts w:ascii="Arial" w:hAnsi="Arial" w:cs="Arial"/>
+        </w:rPr>
+      </w:pPr>
+      <w:r>
+        <w:rPr>
+          <w:rFonts w:ascii="Arial" w:hAnsi="Arial" w:cs="Arial"/>
+          <w:b/>
+          <w:bCs/>
+        </w:rPr>
+        <w:t>Acción:</w:t>
+      </w:r>
+      <w:r>
+        <w:rPr>
+          <w:rFonts w:ascii="Arial" w:hAnsi="Arial" w:cs="Arial"/>
+          <w:b/>
+          <w:bCs/>
+        </w:rPr>
+        <w:t xml:space="preserve"> </w:t>
+      </w:r>
+      <w:r>
+        <w:rPr>
+          <w:rFonts w:ascii="Arial" w:hAnsi="Arial" w:cs="Arial"/>
+        </w:rPr>
+        <w:t>En cuanto la acción</w:t>
+      </w:r>
+      <w:r>
+        <w:rPr>
+          <w:rFonts w:ascii="Arial" w:hAnsi="Arial" w:cs="Arial"/>
+          <w:b/>
+          <w:bCs/>
+        </w:rPr>
+        <w:t xml:space="preserve"> e</w:t>
+      </w:r>
+      <w:r>
+        <w:rPr>
+          <w:rFonts w:ascii="Arial" w:hAnsi="Arial" w:cs="Arial"/>
+        </w:rPr>
+        <w:t>jecuta el movimiento</w:t>
+      </w:r>
+      <w:r>
+        <w:rPr>
+          <w:rFonts w:ascii="Arial" w:hAnsi="Arial" w:cs="Arial"/>
+        </w:rPr>
+        <w:t xml:space="preserve"> c</w:t>
+      </w:r>
+      <w:r>
+        <w:rPr>
+          <w:rFonts w:ascii="Arial" w:hAnsi="Arial" w:cs="Arial"/>
+        </w:rPr>
+        <w:t xml:space="preserve">ambia su velocidad en dirección hacia el </w:t>
+      </w:r>
+      <w:r>
+        <w:rPr>
+          <w:rFonts w:ascii="Arial" w:hAnsi="Arial" w:cs="Arial"/>
+        </w:rPr>
+        <w:t>jugador o</w:t>
+      </w:r>
+      <w:r>
+        <w:rPr>
+          <w:rFonts w:ascii="Arial" w:hAnsi="Arial" w:cs="Arial"/>
+        </w:rPr>
+        <w:t xml:space="preserve"> se mueve aleatoriamente por la pantalla</w:t>
+      </w:r>
+      <w:r>
+        <w:rPr>
+          <w:rFonts w:ascii="Arial" w:hAnsi="Arial" w:cs="Arial"/>
+        </w:rPr>
+        <w:t>, también aprovecha cuando tiene habilidades.</w:t>
+      </w:r>
+    </w:p>
+    <w:p>
+      <w:pPr>
+        <w:pStyle w:val="NormalWeb"/>
+        <w:numPr>
+          <w:ilvl w:val="0"/>
+          <w:numId w:val="1"/>
+        </w:numPr>
+        <w:rPr>
+          <w:rFonts w:ascii="Arial" w:hAnsi="Arial" w:cs="Arial"/>
+        </w:rPr>
+      </w:pPr>
+      <w:r>
+        <w:rPr>
+          <w:rFonts w:ascii="Arial" w:hAnsi="Arial" w:cs="Arial"/>
+          <w:b/>
+          <w:bCs/>
+        </w:rPr>
+        <w:t>Aprendizaje:</w:t>
+      </w:r>
+      <w:r>
+        <w:rPr>
+          <w:rFonts w:ascii="Arial" w:hAnsi="Arial" w:cs="Arial"/>
+        </w:rPr>
+        <w:t xml:space="preserve"> El </w:t>
+      </w:r>
+      <w:r>
+        <w:rPr>
+          <w:rFonts w:ascii="Arial" w:hAnsi="Arial" w:cs="Arial"/>
+        </w:rPr>
+        <w:t xml:space="preserve">virus impostor </w:t>
+      </w:r>
+      <w:r>
+        <w:rPr>
+          <w:rFonts w:ascii="Arial" w:hAnsi="Arial" w:cs="Arial"/>
+        </w:rPr>
+        <w:t xml:space="preserve">tiene una memoria básica. Si el jugador usa una vitamina (potenciador) y lo golpea, el virus "aprende" que el jugador es peligroso en ese estado y guarda esa información. La próxima vez que perciba al jugador con el potenciador activo, su razonamiento cambiará y su acción será huir en lugar de atacar. </w:t>
+      </w:r>
+    </w:p>
+    <w:p>
+      <w:pPr>
+        <w:rPr>
+          <w:rFonts w:ascii="Arial" w:hAnsi="Arial" w:cs="Arial"/>
+          <w:sz w:val="24"/>
+          <w:szCs w:val="24"/>
           <w:lang w:val="es-MX"/>
         </w:rPr>
       </w:pPr>
@@ -203,6 +1148,177 @@
     </w:sectPr>
   </w:body>
 </w:document>
+</file>
+
+<file path=word/endnotes.xml><?xml version="1.0" encoding="utf-8"?>
+<w:endnotes xmlns:wpc="http://schemas.microsoft.com/office/word/2010/wordprocessingCanvas" xmlns:cx="http://schemas.microsoft.com/office/drawing/2014/chartex" xmlns:cx1="http://schemas.microsoft.com/office/drawing/2015/9/8/chartex" xmlns:cx2="http://schemas.microsoft.com/office/drawing/2015/10/21/chartex" xmlns:cx3="http://schemas.microsoft.com/office/drawing/2016/5/9/chartex" xmlns:cx4="http://schemas.microsoft.com/office/drawing/2016/5/10/chartex" xmlns:cx5="http://schemas.microsoft.com/office/drawing/2016/5/11/chartex" xmlns:cx6="http://schemas.microsoft.com/office/drawing/2016/5/12/chartex" xmlns:cx7="http://schemas.microsoft.com/office/drawing/2016/5/13/chartex" xmlns:cx8="http://schemas.microsoft.com/office/drawing/2016/5/14/chartex" xmlns:mc="http://schemas.openxmlformats.org/markup-compatibility/2006" xmlns:aink="http://schemas.microsoft.com/office/drawing/2016/ink" xmlns:am3d="http://schemas.microsoft.com/office/drawing/2017/model3d" xmlns:o="urn:schemas-microsoft-com:office:office" xmlns:r="http://schemas.openxmlformats.org/officeDocument/2006/relationships" xmlns:m="http://schemas.openxmlformats.org/officeDocument/2006/math" xmlns:v="urn:schemas-microsoft-com:vml" xmlns:wp14="http://schemas.microsoft.com/office/word/2010/wordprocessingDrawing" xmlns:wp="http://schemas.openxmlformats.org/drawingml/2006/wordprocessingDrawing" xmlns:w10="urn:schemas-microsoft-com:office:word" xmlns:w="http://schemas.openxmlformats.org/wordprocessingml/2006/main" xmlns:w14="http://schemas.microsoft.com/office/word/2010/wordml" xmlns:w15="http://schemas.microsoft.com/office/word/2012/wordml" xmlns:w16cex="http://schemas.microsoft.com/office/word/2018/wordml/cex" xmlns:w16cid="http://schemas.microsoft.com/office/word/2016/wordml/cid" xmlns:w16="http://schemas.microsoft.com/office/word/2018/wordml" xmlns:w16sdtdh="http://schemas.microsoft.com/office/word/2020/wordml/sdtdatahash" xmlns:w16se="http://schemas.microsoft.com/office/word/2015/wordml/symex" xmlns:wpg="http://schemas.microsoft.com/office/word/2010/wordprocessingGroup" xmlns:wpi="http://schemas.microsoft.com/office/word/2010/wordprocessingInk" xmlns:wne="http://schemas.microsoft.com/office/word/2006/wordml" xmlns:wps="http://schemas.microsoft.com/office/word/2010/wordprocessingShape" mc:Ignorable="w14 w15 w16se w16cid w16 w16cex w16sdtdh wp14">
+  <w:endnote w:type="separator" w:id="-1">
+    <w:p>
+      <w:pPr>
+        <w:spacing w:after="0" w:line="240" w:lineRule="auto"/>
+      </w:pPr>
+      <w:r>
+        <w:separator/>
+      </w:r>
+    </w:p>
+  </w:endnote>
+  <w:endnote w:type="continuationSeparator" w:id="0">
+    <w:p>
+      <w:pPr>
+        <w:spacing w:after="0" w:line="240" w:lineRule="auto"/>
+      </w:pPr>
+      <w:r>
+        <w:continuationSeparator/>
+      </w:r>
+    </w:p>
+  </w:endnote>
+</w:endnotes>
+</file>
+
+<file path=word/footnotes.xml><?xml version="1.0" encoding="utf-8"?>
+<w:footnotes xmlns:wpc="http://schemas.microsoft.com/office/word/2010/wordprocessingCanvas" xmlns:cx="http://schemas.microsoft.com/office/drawing/2014/chartex" xmlns:cx1="http://schemas.microsoft.com/office/drawing/2015/9/8/chartex" xmlns:cx2="http://schemas.microsoft.com/office/drawing/2015/10/21/chartex" xmlns:cx3="http://schemas.microsoft.com/office/drawing/2016/5/9/chartex" xmlns:cx4="http://schemas.microsoft.com/office/drawing/2016/5/10/chartex" xmlns:cx5="http://schemas.microsoft.com/office/drawing/2016/5/11/chartex" xmlns:cx6="http://schemas.microsoft.com/office/drawing/2016/5/12/chartex" xmlns:cx7="http://schemas.microsoft.com/office/drawing/2016/5/13/chartex" xmlns:cx8="http://schemas.microsoft.com/office/drawing/2016/5/14/chartex" xmlns:mc="http://schemas.openxmlformats.org/markup-compatibility/2006" xmlns:aink="http://schemas.microsoft.com/office/drawing/2016/ink" xmlns:am3d="http://schemas.microsoft.com/office/drawing/2017/model3d" xmlns:o="urn:schemas-microsoft-com:office:office" xmlns:r="http://schemas.openxmlformats.org/officeDocument/2006/relationships" xmlns:m="http://schemas.openxmlformats.org/officeDocument/2006/math" xmlns:v="urn:schemas-microsoft-com:vml" xmlns:wp14="http://schemas.microsoft.com/office/word/2010/wordprocessingDrawing" xmlns:wp="http://schemas.openxmlformats.org/drawingml/2006/wordprocessingDrawing" xmlns:w10="urn:schemas-microsoft-com:office:word" xmlns:w="http://schemas.openxmlformats.org/wordprocessingml/2006/main" xmlns:w14="http://schemas.microsoft.com/office/word/2010/wordml" xmlns:w15="http://schemas.microsoft.com/office/word/2012/wordml" xmlns:w16cex="http://schemas.microsoft.com/office/word/2018/wordml/cex" xmlns:w16cid="http://schemas.microsoft.com/office/word/2016/wordml/cid" xmlns:w16="http://schemas.microsoft.com/office/word/2018/wordml" xmlns:w16sdtdh="http://schemas.microsoft.com/office/word/2020/wordml/sdtdatahash" xmlns:w16se="http://schemas.microsoft.com/office/word/2015/wordml/symex" xmlns:wpg="http://schemas.microsoft.com/office/word/2010/wordprocessingGroup" xmlns:wpi="http://schemas.microsoft.com/office/word/2010/wordprocessingInk" xmlns:wne="http://schemas.microsoft.com/office/word/2006/wordml" xmlns:wps="http://schemas.microsoft.com/office/word/2010/wordprocessingShape" mc:Ignorable="w14 w15 w16se w16cid w16 w16cex w16sdtdh wp14">
+  <w:footnote w:type="separator" w:id="-1">
+    <w:p>
+      <w:pPr>
+        <w:spacing w:after="0" w:line="240" w:lineRule="auto"/>
+      </w:pPr>
+      <w:r>
+        <w:separator/>
+      </w:r>
+    </w:p>
+  </w:footnote>
+  <w:footnote w:type="continuationSeparator" w:id="0">
+    <w:p>
+      <w:pPr>
+        <w:spacing w:after="0" w:line="240" w:lineRule="auto"/>
+      </w:pPr>
+      <w:r>
+        <w:continuationSeparator/>
+      </w:r>
+    </w:p>
+  </w:footnote>
+</w:footnotes>
+</file>
+
+<file path=word/numbering.xml><?xml version="1.0" encoding="utf-8"?>
+<w:numbering xmlns:wpc="http://schemas.microsoft.com/office/word/2010/wordprocessingCanvas" xmlns:cx="http://schemas.microsoft.com/office/drawing/2014/chartex" xmlns:cx1="http://schemas.microsoft.com/office/drawing/2015/9/8/chartex" xmlns:cx2="http://schemas.microsoft.com/office/drawing/2015/10/21/chartex" xmlns:cx3="http://schemas.microsoft.com/office/drawing/2016/5/9/chartex" xmlns:cx4="http://schemas.microsoft.com/office/drawing/2016/5/10/chartex" xmlns:cx5="http://schemas.microsoft.com/office/drawing/2016/5/11/chartex" xmlns:cx6="http://schemas.microsoft.com/office/drawing/2016/5/12/chartex" xmlns:cx7="http://schemas.microsoft.com/office/drawing/2016/5/13/chartex" xmlns:cx8="http://schemas.microsoft.com/office/drawing/2016/5/14/chartex" xmlns:mc="http://schemas.openxmlformats.org/markup-compatibility/2006" xmlns:aink="http://schemas.microsoft.com/office/drawing/2016/ink" xmlns:am3d="http://schemas.microsoft.com/office/drawing/2017/model3d" xmlns:o="urn:schemas-microsoft-com:office:office" xmlns:r="http://schemas.openxmlformats.org/officeDocument/2006/relationships" xmlns:m="http://schemas.openxmlformats.org/officeDocument/2006/math" xmlns:v="urn:schemas-microsoft-com:vml" xmlns:wp14="http://schemas.microsoft.com/office/word/2010/wordprocessingDrawing" xmlns:wp="http://schemas.openxmlformats.org/drawingml/2006/wordprocessingDrawing" xmlns:w10="urn:schemas-microsoft-com:office:word" xmlns:w="http://schemas.openxmlformats.org/wordprocessingml/2006/main" xmlns:w14="http://schemas.microsoft.com/office/word/2010/wordml" xmlns:w15="http://schemas.microsoft.com/office/word/2012/wordml" xmlns:w16cex="http://schemas.microsoft.com/office/word/2018/wordml/cex" xmlns:w16cid="http://schemas.microsoft.com/office/word/2016/wordml/cid" xmlns:w16="http://schemas.microsoft.com/office/word/2018/wordml" xmlns:w16sdtdh="http://schemas.microsoft.com/office/word/2020/wordml/sdtdatahash" xmlns:w16se="http://schemas.microsoft.com/office/word/2015/wordml/symex" xmlns:wpg="http://schemas.microsoft.com/office/word/2010/wordprocessingGroup" xmlns:wpi="http://schemas.microsoft.com/office/word/2010/wordprocessingInk" xmlns:wne="http://schemas.microsoft.com/office/word/2006/wordml" xmlns:wps="http://schemas.microsoft.com/office/word/2010/wordprocessingShape" mc:Ignorable="w14 w15 w16se w16cid w16 w16cex w16sdtdh wp14">
+  <w:abstractNum w:abstractNumId="0" w15:restartNumberingAfterBreak="0">
+    <w:nsid w:val="452F5F7D"/>
+    <w:multiLevelType w:val="multilevel"/>
+    <w:tmpl w:val="1B76DE46"/>
+    <w:lvl w:ilvl="0">
+      <w:start w:val="1"/>
+      <w:numFmt w:val="decimal"/>
+      <w:lvlText w:val="%1."/>
+      <w:lvlJc w:val="left"/>
+      <w:pPr>
+        <w:tabs>
+          <w:tab w:val="num" w:pos="720"/>
+        </w:tabs>
+        <w:ind w:left="720" w:hanging="360"/>
+      </w:pPr>
+    </w:lvl>
+    <w:lvl w:ilvl="1" w:tentative="1">
+      <w:start w:val="1"/>
+      <w:numFmt w:val="decimal"/>
+      <w:lvlText w:val="%2."/>
+      <w:lvlJc w:val="left"/>
+      <w:pPr>
+        <w:tabs>
+          <w:tab w:val="num" w:pos="1440"/>
+        </w:tabs>
+        <w:ind w:left="1440" w:hanging="360"/>
+      </w:pPr>
+    </w:lvl>
+    <w:lvl w:ilvl="2" w:tentative="1">
+      <w:start w:val="1"/>
+      <w:numFmt w:val="decimal"/>
+      <w:lvlText w:val="%3."/>
+      <w:lvlJc w:val="left"/>
+      <w:pPr>
+        <w:tabs>
+          <w:tab w:val="num" w:pos="2160"/>
+        </w:tabs>
+        <w:ind w:left="2160" w:hanging="360"/>
+      </w:pPr>
+    </w:lvl>
+    <w:lvl w:ilvl="3" w:tentative="1">
+      <w:start w:val="1"/>
+      <w:numFmt w:val="decimal"/>
+      <w:lvlText w:val="%4."/>
+      <w:lvlJc w:val="left"/>
+      <w:pPr>
+        <w:tabs>
+          <w:tab w:val="num" w:pos="2880"/>
+        </w:tabs>
+        <w:ind w:left="2880" w:hanging="360"/>
+      </w:pPr>
+    </w:lvl>
+    <w:lvl w:ilvl="4" w:tentative="1">
+      <w:start w:val="1"/>
+      <w:numFmt w:val="decimal"/>
+      <w:lvlText w:val="%5."/>
+      <w:lvlJc w:val="left"/>
+      <w:pPr>
+        <w:tabs>
+          <w:tab w:val="num" w:pos="3600"/>
+        </w:tabs>
+        <w:ind w:left="3600" w:hanging="360"/>
+      </w:pPr>
+    </w:lvl>
+    <w:lvl w:ilvl="5" w:tentative="1">
+      <w:start w:val="1"/>
+      <w:numFmt w:val="decimal"/>
+      <w:lvlText w:val="%6."/>
+      <w:lvlJc w:val="left"/>
+      <w:pPr>
+        <w:tabs>
+          <w:tab w:val="num" w:pos="4320"/>
+        </w:tabs>
+        <w:ind w:left="4320" w:hanging="360"/>
+      </w:pPr>
+    </w:lvl>
+    <w:lvl w:ilvl="6" w:tentative="1">
+      <w:start w:val="1"/>
+      <w:numFmt w:val="decimal"/>
+      <w:lvlText w:val="%7."/>
+      <w:lvlJc w:val="left"/>
+      <w:pPr>
+        <w:tabs>
+          <w:tab w:val="num" w:pos="5040"/>
+        </w:tabs>
+        <w:ind w:left="5040" w:hanging="360"/>
+      </w:pPr>
+    </w:lvl>
+    <w:lvl w:ilvl="7" w:tentative="1">
+      <w:start w:val="1"/>
+      <w:numFmt w:val="decimal"/>
+      <w:lvlText w:val="%8."/>
+      <w:lvlJc w:val="left"/>
+      <w:pPr>
+        <w:tabs>
+          <w:tab w:val="num" w:pos="5760"/>
+        </w:tabs>
+        <w:ind w:left="5760" w:hanging="360"/>
+      </w:pPr>
+    </w:lvl>
+    <w:lvl w:ilvl="8" w:tentative="1">
+      <w:start w:val="1"/>
+      <w:numFmt w:val="decimal"/>
+      <w:lvlText w:val="%9."/>
+      <w:lvlJc w:val="left"/>
+      <w:pPr>
+        <w:tabs>
+          <w:tab w:val="num" w:pos="6480"/>
+        </w:tabs>
+        <w:ind w:left="6480" w:hanging="360"/>
+      </w:pPr>
+    </w:lvl>
+  </w:abstractNum>
+  <w:num w:numId="1">
+    <w:abstractNumId w:val="0"/>
+  </w:num>
+</w:numbering>
 </file>
 
 <file path=word/styles.xml><?xml version="1.0" encoding="utf-8"?>
@@ -631,6 +1747,80 @@
     <w:semiHidden/>
     <w:unhideWhenUsed/>
   </w:style>
+  <w:style w:type="paragraph" w:styleId="Encabezado">
+    <w:name w:val="header"/>
+    <w:basedOn w:val="Normal"/>
+    <w:link w:val="EncabezadoCar"/>
+    <w:uiPriority w:val="99"/>
+    <w:unhideWhenUsed/>
+    <w:rsid w:val="0064381E"/>
+    <w:pPr>
+      <w:tabs>
+        <w:tab w:val="center" w:pos="4419"/>
+        <w:tab w:val="right" w:pos="8838"/>
+      </w:tabs>
+      <w:spacing w:after="0" w:line="240" w:lineRule="auto"/>
+    </w:pPr>
+  </w:style>
+  <w:style w:type="character" w:customStyle="1" w:styleId="EncabezadoCar">
+    <w:name w:val="Encabezado Car"/>
+    <w:basedOn w:val="Fuentedeprrafopredeter"/>
+    <w:link w:val="Encabezado"/>
+    <w:uiPriority w:val="99"/>
+    <w:rsid w:val="0064381E"/>
+  </w:style>
+  <w:style w:type="paragraph" w:styleId="Piedepgina">
+    <w:name w:val="footer"/>
+    <w:basedOn w:val="Normal"/>
+    <w:link w:val="PiedepginaCar"/>
+    <w:uiPriority w:val="99"/>
+    <w:unhideWhenUsed/>
+    <w:rsid w:val="0064381E"/>
+    <w:pPr>
+      <w:tabs>
+        <w:tab w:val="center" w:pos="4419"/>
+        <w:tab w:val="right" w:pos="8838"/>
+      </w:tabs>
+      <w:spacing w:after="0" w:line="240" w:lineRule="auto"/>
+    </w:pPr>
+  </w:style>
+  <w:style w:type="character" w:customStyle="1" w:styleId="PiedepginaCar">
+    <w:name w:val="Pie de página Car"/>
+    <w:basedOn w:val="Fuentedeprrafopredeter"/>
+    <w:link w:val="Piedepgina"/>
+    <w:uiPriority w:val="99"/>
+    <w:rsid w:val="0064381E"/>
+  </w:style>
+  <w:style w:type="paragraph" w:styleId="NormalWeb">
+    <w:name w:val="Normal (Web)"/>
+    <w:basedOn w:val="Normal"/>
+    <w:uiPriority w:val="99"/>
+    <w:semiHidden/>
+    <w:unhideWhenUsed/>
+    <w:rsid w:val="00D037C9"/>
+    <w:pPr>
+      <w:spacing w:before="100" w:beforeAutospacing="1" w:after="100" w:afterAutospacing="1" w:line="240" w:lineRule="auto"/>
+    </w:pPr>
+    <w:rPr>
+      <w:rFonts w:ascii="Times New Roman" w:eastAsia="Times New Roman" w:hAnsi="Times New Roman" w:cs="Times New Roman"/>
+      <w:sz w:val="24"/>
+      <w:szCs w:val="24"/>
+      <w:lang w:eastAsia="es-CO"/>
+    </w:rPr>
+  </w:style>
+  <w:style w:type="character" w:styleId="CdigoHTML">
+    <w:name w:val="HTML Code"/>
+    <w:basedOn w:val="Fuentedeprrafopredeter"/>
+    <w:uiPriority w:val="99"/>
+    <w:semiHidden/>
+    <w:unhideWhenUsed/>
+    <w:rsid w:val="00D037C9"/>
+    <w:rPr>
+      <w:rFonts w:ascii="Courier New" w:eastAsia="Times New Roman" w:hAnsi="Courier New" w:cs="Courier New"/>
+      <w:sz w:val="20"/>
+      <w:szCs w:val="20"/>
+    </w:rPr>
+  </w:style>
 </w:styles>
 </file>
 

</xml_diff>